<commit_message>
docs: edit consensus research
</commit_message>
<xml_diff>
--- a/Quorum consensus protocol comparison report.docx
+++ b/Quorum consensus protocol comparison report.docx
@@ -568,7 +568,21 @@
           <w:lang w:val="en-US"/>
         </w:rPr>
         <w:tab/>
-        <w:t>F is the number of node considered as faulty nodes</w:t>
+        <w:t xml:space="preserve">F is the number of </w:t>
+      </w:r>
+      <w:proofErr w:type="gramStart"/>
+      <w:r>
+        <w:rPr>
+          <w:lang w:val="en-US"/>
+        </w:rPr>
+        <w:t>node</w:t>
+      </w:r>
+      <w:proofErr w:type="gramEnd"/>
+      <w:r>
+        <w:rPr>
+          <w:lang w:val="en-US"/>
+        </w:rPr>
+        <w:t xml:space="preserve"> considered as faulty nodes</w:t>
       </w:r>
     </w:p>
     <w:p>
@@ -921,6 +935,12 @@
         </w:rPr>
         <w:t xml:space="preserve">Because we need don’t need </w:t>
       </w:r>
+      <w:r>
+        <w:rPr>
+          <w:lang w:val="en-US"/>
+        </w:rPr>
+        <w:t>instant finality write from the use case, we left with the Clique consensus</w:t>
+      </w:r>
     </w:p>
     <w:p>
       <w:pPr>
@@ -1008,43 +1028,54 @@
         </w:rPr>
         <w:tab/>
       </w:r>
-      <w:proofErr w:type="spellStart"/>
       <w:r>
         <w:rPr>
           <w:i/>
           <w:iCs/>
           <w:lang w:val="en-US"/>
         </w:rPr>
-        <w:t>ConsenSys</w:t>
-      </w:r>
-      <w:proofErr w:type="spellEnd"/>
+        <w:t>ConsenSys/quorum</w:t>
+      </w:r>
+      <w:r>
+        <w:rPr>
+          <w:lang w:val="en-US"/>
+        </w:rPr>
+        <w:t>. ConsenSys, 2022. Accessed: Mar. 04, 2022. [Online]. Available: https://github.com/ConsenSys/quorum</w:t>
+      </w:r>
+    </w:p>
+    <w:p>
+      <w:pPr>
+        <w:pStyle w:val="Bibliography"/>
+        <w:rPr>
+          <w:lang w:val="en-US"/>
+        </w:rPr>
+      </w:pPr>
+      <w:r>
+        <w:rPr>
+          <w:lang w:val="en-US"/>
+        </w:rPr>
+        <w:t>[3]</w:t>
+      </w:r>
+      <w:r>
+        <w:rPr>
+          <w:lang w:val="en-US"/>
+        </w:rPr>
+        <w:tab/>
+        <w:t xml:space="preserve">A. Baliga, I. Subhod, P. Kamat, and S. Chatterjee, “Performance Evaluation of the Quorum Blockchain Platform,” </w:t>
+      </w:r>
       <w:r>
         <w:rPr>
           <w:i/>
           <w:iCs/>
           <w:lang w:val="en-US"/>
         </w:rPr>
-        <w:t>/quorum</w:t>
-      </w:r>
-      <w:r>
-        <w:rPr>
-          <w:lang w:val="en-US"/>
-        </w:rPr>
-        <w:t xml:space="preserve">. </w:t>
-      </w:r>
-      <w:proofErr w:type="spellStart"/>
-      <w:r>
-        <w:rPr>
-          <w:lang w:val="en-US"/>
-        </w:rPr>
-        <w:t>ConsenSys</w:t>
-      </w:r>
-      <w:proofErr w:type="spellEnd"/>
-      <w:r>
-        <w:rPr>
-          <w:lang w:val="en-US"/>
-        </w:rPr>
-        <w:t>, 2022. Accessed: Mar. 04, 2022. [Online]. Available: https://github.com/ConsenSys/quorum</w:t>
+        <w:t>ArXiv180903421 Cs</w:t>
+      </w:r>
+      <w:r>
+        <w:rPr>
+          <w:lang w:val="en-US"/>
+        </w:rPr>
+        <w:t>, Jul. 2018, Accessed: Feb. 24, 2022. [Online]. Available: http://arxiv.org/abs/1809.03421</w:t>
       </w:r>
     </w:p>
     <w:p>
@@ -1058,56 +1089,13 @@
         <w:rPr>
           <w:lang w:val="en-US"/>
         </w:rPr>
-        <w:t>[3]</w:t>
+        <w:t>[4]</w:t>
       </w:r>
       <w:r>
         <w:rPr>
           <w:lang w:val="en-US"/>
         </w:rPr>
         <w:tab/>
-        <w:t xml:space="preserve">A. </w:t>
-      </w:r>
-      <w:proofErr w:type="spellStart"/>
-      <w:r>
-        <w:rPr>
-          <w:lang w:val="en-US"/>
-        </w:rPr>
-        <w:t>Baliga</w:t>
-      </w:r>
-      <w:proofErr w:type="spellEnd"/>
-      <w:r>
-        <w:rPr>
-          <w:lang w:val="en-US"/>
-        </w:rPr>
-        <w:t xml:space="preserve">, I. </w:t>
-      </w:r>
-      <w:proofErr w:type="spellStart"/>
-      <w:r>
-        <w:rPr>
-          <w:lang w:val="en-US"/>
-        </w:rPr>
-        <w:t>Subhod</w:t>
-      </w:r>
-      <w:proofErr w:type="spellEnd"/>
-      <w:r>
-        <w:rPr>
-          <w:lang w:val="en-US"/>
-        </w:rPr>
-        <w:t xml:space="preserve">, P. </w:t>
-      </w:r>
-      <w:proofErr w:type="spellStart"/>
-      <w:r>
-        <w:rPr>
-          <w:lang w:val="en-US"/>
-        </w:rPr>
-        <w:t>Kamat</w:t>
-      </w:r>
-      <w:proofErr w:type="spellEnd"/>
-      <w:r>
-        <w:rPr>
-          <w:lang w:val="en-US"/>
-        </w:rPr>
-        <w:t xml:space="preserve">, and S. Chatterjee, “Performance Evaluation of the Quorum Blockchain Platform,” </w:t>
       </w:r>
       <w:r>
         <w:rPr>
@@ -1115,51 +1103,7 @@
           <w:iCs/>
           <w:lang w:val="en-US"/>
         </w:rPr>
-        <w:t>ArXiv180903421 Cs</w:t>
-      </w:r>
-      <w:r>
-        <w:rPr>
-          <w:lang w:val="en-US"/>
-        </w:rPr>
-        <w:t>, Jul. 2018, Accessed: Feb. 24, 2022. [Online]. Available: http://arxiv.org/abs/1809.03421</w:t>
-      </w:r>
-    </w:p>
-    <w:p>
-      <w:pPr>
-        <w:pStyle w:val="Bibliography"/>
-        <w:rPr>
-          <w:lang w:val="en-US"/>
-        </w:rPr>
-      </w:pPr>
-      <w:r>
-        <w:rPr>
-          <w:lang w:val="en-US"/>
-        </w:rPr>
-        <w:t>[4]</w:t>
-      </w:r>
-      <w:r>
-        <w:rPr>
-          <w:lang w:val="en-US"/>
-        </w:rPr>
-        <w:tab/>
-      </w:r>
-      <w:proofErr w:type="spellStart"/>
-      <w:r>
-        <w:rPr>
-          <w:i/>
-          <w:iCs/>
-          <w:lang w:val="en-US"/>
-        </w:rPr>
-        <w:t>hyperledger</w:t>
-      </w:r>
-      <w:proofErr w:type="spellEnd"/>
-      <w:r>
-        <w:rPr>
-          <w:i/>
-          <w:iCs/>
-          <w:lang w:val="en-US"/>
-        </w:rPr>
-        <w:t>/caliper</w:t>
+        <w:t>hyperledger/caliper</w:t>
       </w:r>
       <w:r>
         <w:rPr>

</xml_diff>